<commit_message>
le truc a vico passe pas
</commit_message>
<xml_diff>
--- a/Cahier_des_charges_simplifié_placement_salle_DS.docx
+++ b/Cahier_des_charges_simplifié_placement_salle_DS.docx
@@ -47,6 +47,15 @@
       <w:r>
         <w:t xml:space="preserve">le personnel hors professeur qui peut dans certains cas surveiller les salles DS. </w:t>
       </w:r>
+      <w:r>
+        <w:t xml:space="preserve">Les utilisateurs auront besoin de pouvoir, à partir d’un fichier Excel contenant les informations des élèves, obtenir une liste des élèves avec des placements aléatoires, avec la possibilité de modifier la salle et les </w:t>
+      </w:r>
+      <w:r>
+        <w:t xml:space="preserve">conditions </w:t>
+      </w:r>
+      <w:r>
+        <w:t>du placement.</w:t>
+      </w:r>
     </w:p>
     <w:p>
       <w:pPr>
@@ -58,41 +67,67 @@
     </w:p>
     <w:p>
       <w:r>
-        <w:t>Lister les fonctionnalités indispensables (MVP) et secondaires (bonus si temps).</w:t>
+        <w:t>L’application doit permettre imposer des places à certains élèves, de supprimer des places et d’imposer un placement ne laissant pas 2 élèves du même groupe être proche. Il serait également préférable d’implémenter les fonctionnalités suivantes :</w:t>
       </w:r>
     </w:p>
     <w:p>
+      <w:pPr>
+        <w:pStyle w:val="Paragraphedeliste"/>
+        <w:numPr>
+          <w:ilvl w:val="0"/>
+          <w:numId w:val="10"/>
+        </w:numPr>
+      </w:pPr>
       <w:r>
-        <w:t>Exemple : Créer une tâche, partager une liste, notifications.</w:t>
+        <w:t>Empêcher des personnes d’être à proximité ;</w:t>
       </w:r>
     </w:p>
     <w:p>
+      <w:pPr>
+        <w:pStyle w:val="Paragraphedeliste"/>
+        <w:numPr>
+          <w:ilvl w:val="0"/>
+          <w:numId w:val="10"/>
+        </w:numPr>
+      </w:pPr>
       <w:r>
-        <w:br/>
-        <w:t xml:space="preserve">Fonctionnalités Must Have : </w:t>
-      </w:r>
-      <w:r>
-        <w:t>Imposer des places, supprimer des places, imposer un placement spécifique</w:t>
-      </w:r>
-      <w:r>
-        <w:t xml:space="preserve"> (par groupe)</w:t>
-      </w:r>
-      <w:r>
-        <w:t>.</w:t>
+        <w:t>Pouvoir modifier manuellement les propositions de placement ;</w:t>
       </w:r>
     </w:p>
     <w:p>
+      <w:pPr>
+        <w:pStyle w:val="Paragraphedeliste"/>
+        <w:numPr>
+          <w:ilvl w:val="0"/>
+          <w:numId w:val="10"/>
+        </w:numPr>
+      </w:pPr>
       <w:r>
-        <w:t xml:space="preserve">Fonctionnalités Nice to Have : </w:t>
+        <w:t>Imposer un placement ne laissant pas 2 élèves du même sous-groupe proches ;</w:t>
       </w:r>
+    </w:p>
+    <w:p>
+      <w:pPr>
+        <w:pStyle w:val="Paragraphedeliste"/>
+        <w:numPr>
+          <w:ilvl w:val="0"/>
+          <w:numId w:val="10"/>
+        </w:numPr>
+      </w:pPr>
       <w:r>
-        <w:t xml:space="preserve">Imposer que des personnes ne soient pas à proximité, modifier la proposition manuellement, </w:t>
+        <w:t>Récupérer un plan avec les informations des élèves pour chaque place ;</w:t>
       </w:r>
+    </w:p>
+    <w:p>
+      <w:pPr>
+        <w:pStyle w:val="Paragraphedeliste"/>
+        <w:numPr>
+          <w:ilvl w:val="0"/>
+          <w:numId w:val="10"/>
+        </w:numPr>
+      </w:pPr>
       <w:r>
-        <w:t>récupérer</w:t>
-      </w:r>
-      <w:r>
-        <w:t xml:space="preserve"> plan avec informations pour chaque place, modifier la disposition de la salle.</w:t>
+        <w:t>Pouvoir modifier la disposition de la salle (ajout de tables, changement d’alignements…).</w:t>
       </w:r>
     </w:p>
     <w:p>
@@ -105,48 +140,42 @@
     </w:p>
     <w:p>
       <w:r>
-        <w:t>Indiquer les contraintes techniques, organisationnelles et de ressources.</w:t>
+        <w:t xml:space="preserve">Le projet </w:t>
+      </w:r>
+      <w:r>
+        <w:t xml:space="preserve">ne nous impose que peu de contraintes techniques, l’accès par web et le chargement et la génération de fichiers </w:t>
+      </w:r>
+      <w:proofErr w:type="spellStart"/>
+      <w:r>
+        <w:t>Excels</w:t>
+      </w:r>
+      <w:proofErr w:type="spellEnd"/>
+      <w:r>
+        <w:t xml:space="preserve"> représentant les seules contraintes techniques. Pour la partie organisationnelle, il y a plusieurs dates importantes :</w:t>
       </w:r>
     </w:p>
     <w:p>
       <w:r>
-        <w:t>Exemple : Utilisable sur navigateur, rendu final prévu janvier 2025.</w:t>
+        <w:t>-le dépôt du dossier d’analyse le 12 octobre 2025 ;</w:t>
       </w:r>
     </w:p>
     <w:p>
       <w:r>
-        <w:br/>
-        <w:t xml:space="preserve">Contraintes techniques : </w:t>
-      </w:r>
-      <w:r>
-        <w:t xml:space="preserve">lire un format </w:t>
-      </w:r>
-      <w:proofErr w:type="spellStart"/>
-      <w:r>
-        <w:t>excel</w:t>
-      </w:r>
-      <w:proofErr w:type="spellEnd"/>
-      <w:r>
-        <w:t xml:space="preserve"> et générer au même format, à préciser.</w:t>
+        <w:t>-le dépôt du poster le 8 janvier 2026</w:t>
       </w:r>
     </w:p>
     <w:p>
       <w:r>
-        <w:t xml:space="preserve">Contraintes organisationnelles : </w:t>
-      </w:r>
-      <w:r>
-        <w:t>Partie analyse à rendre début octobre, premier prototype à rendre début décembre</w:t>
-      </w:r>
-      <w:r>
-        <w:t>, rendu final prévu mi-janvier.</w:t>
+        <w:lastRenderedPageBreak/>
+        <w:t>-le dépôt du document de participation, de la présentation et de la feuille des tâches le 15 janvier 2026.</w:t>
       </w:r>
     </w:p>
     <w:p>
       <w:r>
-        <w:t xml:space="preserve">Contraintes ressources : </w:t>
+        <w:t>Il est également nécessaire de déposer un compte rendu pour chaque semaine. La partie conception et modélisation se déroulera en octobre et devra être finie début novembre, le développement du premier prototype commencera en parallèle de la partie conception et modélisation, et ce jusqu’au début des vacances de noël. Le développement du deuxième prototype commencera durant les vacances de noël jusqu’au 15 janvier. L</w:t>
       </w:r>
       <w:r>
-        <w:t>groupe de 3, à préciser.</w:t>
+        <w:t>a seule contrainte notable en termes de ressources est le nombre de personne du groupe, qui est de 3.</w:t>
       </w:r>
     </w:p>
     <w:p>
@@ -154,27 +183,21 @@
         <w:pStyle w:val="Titre1"/>
       </w:pPr>
       <w:r>
-        <w:lastRenderedPageBreak/>
-        <w:t>5. Indicateurs de succès ✅ (optionnel)</w:t>
+        <w:t xml:space="preserve">5. Indicateurs de succès </w:t>
+      </w:r>
+      <w:r>
+        <w:rPr>
+          <w:rFonts w:ascii="Segoe UI Emoji" w:hAnsi="Segoe UI Emoji" w:cs="Segoe UI Emoji"/>
+        </w:rPr>
+        <w:t>✅</w:t>
+      </w:r>
+      <w:r>
+        <w:t xml:space="preserve"> </w:t>
       </w:r>
     </w:p>
     <w:p>
       <w:r>
-        <w:t>Comment saura-t-on que le projet est réussi ?</w:t>
-      </w:r>
-    </w:p>
-    <w:p>
-      <w:r>
-        <w:t>Exemple : L’utilisateur peut créer, modifier et supprimer une tâche.</w:t>
-      </w:r>
-    </w:p>
-    <w:p>
-      <w:r>
-        <w:br/>
-        <w:t xml:space="preserve">Indicateurs de succès : </w:t>
-      </w:r>
-      <w:r>
-        <w:t>Navigation intuitive.</w:t>
+        <w:t>Un indicateur du succès de l’application serait la possibilité de générer une liste de placements aléatoires avec différentes contraintes.</w:t>
       </w:r>
     </w:p>
     <w:sectPr>
@@ -360,6 +383,119 @@
       </w:rPr>
     </w:lvl>
   </w:abstractNum>
+  <w:abstractNum w:abstractNumId="9" w15:restartNumberingAfterBreak="0">
+    <w:nsid w:val="72C96B92"/>
+    <w:multiLevelType w:val="hybridMultilevel"/>
+    <w:tmpl w:val="5508AC9A"/>
+    <w:lvl w:ilvl="0" w:tplc="13888DEE">
+      <w:start w:val="3"/>
+      <w:numFmt w:val="bullet"/>
+      <w:lvlText w:val="-"/>
+      <w:lvlJc w:val="left"/>
+      <w:pPr>
+        <w:ind w:left="720" w:hanging="360"/>
+      </w:pPr>
+      <w:rPr>
+        <w:rFonts w:ascii="Cambria" w:eastAsiaTheme="minorEastAsia" w:hAnsi="Cambria" w:cstheme="minorBidi" w:hint="default"/>
+      </w:rPr>
+    </w:lvl>
+    <w:lvl w:ilvl="1" w:tplc="040C0003" w:tentative="1">
+      <w:start w:val="1"/>
+      <w:numFmt w:val="bullet"/>
+      <w:lvlText w:val="o"/>
+      <w:lvlJc w:val="left"/>
+      <w:pPr>
+        <w:ind w:left="1440" w:hanging="360"/>
+      </w:pPr>
+      <w:rPr>
+        <w:rFonts w:ascii="Courier New" w:hAnsi="Courier New" w:cs="Courier New" w:hint="default"/>
+      </w:rPr>
+    </w:lvl>
+    <w:lvl w:ilvl="2" w:tplc="040C0005" w:tentative="1">
+      <w:start w:val="1"/>
+      <w:numFmt w:val="bullet"/>
+      <w:lvlText w:val=""/>
+      <w:lvlJc w:val="left"/>
+      <w:pPr>
+        <w:ind w:left="2160" w:hanging="360"/>
+      </w:pPr>
+      <w:rPr>
+        <w:rFonts w:ascii="Wingdings" w:hAnsi="Wingdings" w:hint="default"/>
+      </w:rPr>
+    </w:lvl>
+    <w:lvl w:ilvl="3" w:tplc="040C0001" w:tentative="1">
+      <w:start w:val="1"/>
+      <w:numFmt w:val="bullet"/>
+      <w:lvlText w:val=""/>
+      <w:lvlJc w:val="left"/>
+      <w:pPr>
+        <w:ind w:left="2880" w:hanging="360"/>
+      </w:pPr>
+      <w:rPr>
+        <w:rFonts w:ascii="Symbol" w:hAnsi="Symbol" w:hint="default"/>
+      </w:rPr>
+    </w:lvl>
+    <w:lvl w:ilvl="4" w:tplc="040C0003" w:tentative="1">
+      <w:start w:val="1"/>
+      <w:numFmt w:val="bullet"/>
+      <w:lvlText w:val="o"/>
+      <w:lvlJc w:val="left"/>
+      <w:pPr>
+        <w:ind w:left="3600" w:hanging="360"/>
+      </w:pPr>
+      <w:rPr>
+        <w:rFonts w:ascii="Courier New" w:hAnsi="Courier New" w:cs="Courier New" w:hint="default"/>
+      </w:rPr>
+    </w:lvl>
+    <w:lvl w:ilvl="5" w:tplc="040C0005" w:tentative="1">
+      <w:start w:val="1"/>
+      <w:numFmt w:val="bullet"/>
+      <w:lvlText w:val=""/>
+      <w:lvlJc w:val="left"/>
+      <w:pPr>
+        <w:ind w:left="4320" w:hanging="360"/>
+      </w:pPr>
+      <w:rPr>
+        <w:rFonts w:ascii="Wingdings" w:hAnsi="Wingdings" w:hint="default"/>
+      </w:rPr>
+    </w:lvl>
+    <w:lvl w:ilvl="6" w:tplc="040C0001" w:tentative="1">
+      <w:start w:val="1"/>
+      <w:numFmt w:val="bullet"/>
+      <w:lvlText w:val=""/>
+      <w:lvlJc w:val="left"/>
+      <w:pPr>
+        <w:ind w:left="5040" w:hanging="360"/>
+      </w:pPr>
+      <w:rPr>
+        <w:rFonts w:ascii="Symbol" w:hAnsi="Symbol" w:hint="default"/>
+      </w:rPr>
+    </w:lvl>
+    <w:lvl w:ilvl="7" w:tplc="040C0003" w:tentative="1">
+      <w:start w:val="1"/>
+      <w:numFmt w:val="bullet"/>
+      <w:lvlText w:val="o"/>
+      <w:lvlJc w:val="left"/>
+      <w:pPr>
+        <w:ind w:left="5760" w:hanging="360"/>
+      </w:pPr>
+      <w:rPr>
+        <w:rFonts w:ascii="Courier New" w:hAnsi="Courier New" w:cs="Courier New" w:hint="default"/>
+      </w:rPr>
+    </w:lvl>
+    <w:lvl w:ilvl="8" w:tplc="040C0005" w:tentative="1">
+      <w:start w:val="1"/>
+      <w:numFmt w:val="bullet"/>
+      <w:lvlText w:val=""/>
+      <w:lvlJc w:val="left"/>
+      <w:pPr>
+        <w:ind w:left="6480" w:hanging="360"/>
+      </w:pPr>
+      <w:rPr>
+        <w:rFonts w:ascii="Wingdings" w:hAnsi="Wingdings" w:hint="default"/>
+      </w:rPr>
+    </w:lvl>
+  </w:abstractNum>
   <w:num w:numId="1">
     <w:abstractNumId w:val="8"/>
   </w:num>
@@ -386,6 +522,9 @@
   </w:num>
   <w:num w:numId="9">
     <w:abstractNumId w:val="0"/>
+  </w:num>
+  <w:num w:numId="10">
+    <w:abstractNumId w:val="9"/>
   </w:num>
 </w:numbering>
 </file>

</xml_diff>